<commit_message>
Add narrated Signal Desk demo submission
</commit_message>
<xml_diff>
--- a/submission/Signal_Desk_Capstone_Evidence.docx
+++ b/submission/Signal_Desk_Capstone_Evidence.docx
@@ -395,7 +395,7 @@
                 <w:rFonts w:ascii="Aptos" w:hAnsi="Aptos"/>
                 <w:sz w:val="18"/>
               </w:rPr>
-              <w:t>October 3, 2026</w:t>
+              <w:t>October 7, 2026</w:t>
             </w:r>
           </w:p>
         </w:tc>
@@ -1047,7 +1047,7 @@
                 <w:rFonts w:ascii="Aptos" w:hAnsi="Aptos"/>
                 <w:sz w:val="18"/>
               </w:rPr>
-              <w:t>285 tests and Ruff pass</w:t>
+              <w:t>281 tests and Ruff pass</w:t>
             </w:r>
           </w:p>
         </w:tc>
@@ -1079,7 +1079,7 @@
                 <w:rFonts w:ascii="Aptos" w:hAnsi="Aptos"/>
                 <w:sz w:val="18"/>
               </w:rPr>
-              <w:t>Local verification on October 3, 2026</w:t>
+              <w:t>Local verification on October 7, 2026</w:t>
             </w:r>
           </w:p>
         </w:tc>
@@ -1202,7 +1202,7 @@
     </w:p>
     <w:p>
       <w:r>
-        <w:t>Render hosts the Flask frontend and FastMCP application tier. Databricks owns the Spark pipelines, Delta tables, SQL analytics, AI Search, and Agent Bricks Supervisor. Lakebase provides operational storage and serving copies. Short-lived signed assertions carry the authenticated browser identity to MCP, while separate machine credentials protect platform-to-platform calls.</w:t>
+        <w:t>Render hosts the Flask frontend and FastMCP application tier. Databricks owns the Spark pipelines, Delta tables, SQL analytics, AI Search, and Agent Bricks Supervisor. Lakebase provides operational storage and market-serving data. Short-lived signed assertions carry authenticated browser identity to MCP; a fixed Supervisor credential protects agent calls, and the owner-approved shared workspace identity supports bounded AI Search and Gold reads.</w:t>
       </w:r>
     </w:p>
     <w:p>
@@ -3051,7 +3051,7 @@
         <w:spacing w:after="60"/>
       </w:pPr>
       <w:r>
-        <w:t>docs/SPLIT_WORKSPACE_APP_DEPLOYMENT_PLAN.md records the boundary between Render and Databricks.</w:t>
+        <w:t>docs/RENDER_DEPLOYMENT_PLAN.md records the boundary between Render and Databricks.</w:t>
       </w:r>
     </w:p>
     <w:p>
@@ -3192,7 +3192,7 @@
     </w:p>
     <w:p>
       <w:r>
-        <w:t>The screenshots in this section were captured from the deployed application and Render dashboard on October 3 and 4, 2026. They contain no credentials, access tokens, connection strings, or private research bodies.</w:t>
+        <w:t>The screenshots in this section were captured from the deployed application and Render dashboard on October 3 and 4, 2026, and the evidence package was revalidated on October 7, 2026. They contain no credentials, access tokens, connection strings, or private research bodies.</w:t>
       </w:r>
     </w:p>
     <w:p>
@@ -3647,7 +3647,7 @@
                 <w:rFonts w:ascii="Aptos" w:hAnsi="Aptos"/>
                 <w:sz w:val="18"/>
               </w:rPr>
-              <w:t>285 passed</w:t>
+              <w:t>281 passed</w:t>
             </w:r>
           </w:p>
         </w:tc>
@@ -4248,7 +4248,7 @@
         <w:spacing w:after="60"/>
       </w:pPr>
       <w:r>
-        <w:t>Finish with the architecture diagram, the Volume and Variety counts, the Live Render deployment, and the 285-test result.</w:t>
+        <w:t>Finish with the architecture diagram, the Volume and Variety counts, the Live Render deployment, and the 281-test result.</w:t>
       </w:r>
     </w:p>
     <w:p>

</xml_diff>